<commit_message>
Add bilingual sitemap, space-aware nav brand, and rebuild Deployment.
Ship a human sitemap under primary nav, tighten desktop nav spacing with brand text that shows only when the bar has room, and refresh the Deployment package for upload.

Co-authored-by: Cursor <cursoragent@cursor.com>
</commit_message>
<xml_diff>
--- a/documents/Legal/05-Legal-Compliance-Gap-Review.docx
+++ b/documents/Legal/05-Legal-Compliance-Gap-Review.docx
@@ -7601,21 +7601,6 @@
           <w:bCs/>
           <w:i/>
         </w:rPr>
-        <w:t>Variant 1 — Detailed with context</w:t>
-      </w:r>
-    </w:p>
-    <w:p>
-      <w:pPr>
-        <w:rPr>
-          <w:i/>
-        </w:rPr>
-      </w:pPr>
-      <w:r>
-        <w:rPr>
-          <w:b/>
-          <w:bCs/>
-          <w:i/>
-        </w:rPr>
         <w:t>Mövzu:</w:t>
       </w:r>
       <w:r>
@@ -7917,7 +7902,6 @@
         <w:rPr>
           <w:i/>
         </w:rPr>
-        <w:lastRenderedPageBreak/>
         <w:t>Faydalı olarsa, saytın strukturunu və bu sənədlərin necə istifadə olunacağını izah etmək üçün qısa bir görüş təşkil edə bilərik.</w:t>
       </w:r>
     </w:p>
@@ -7931,6 +7915,7 @@
         <w:rPr>
           <w:i/>
         </w:rPr>
+        <w:lastRenderedPageBreak/>
         <w:t>Bu baxış üçün təxmini vaxt və qonorar məbləğini bildirməyinizi xahiş edirik.</w:t>
       </w:r>
     </w:p>

</xml_diff>